<commit_message>
Dominios de e-mail: org Blink levantada (3 cadastros, nenhum verificado, salesforce.com invalido, DNS sem TXT); relatorio Word regerado com a Blink
Co-Authored-By: Claude Fable 5.1 <noreply@anthropic.com>
</commit_message>
<xml_diff>
--- a/docs/2026-09-18-relatorio-verificacao-dominios-email.docx
+++ b/docs/2026-09-18-relatorio-verificacao-dominios-email.docx
@@ -96,7 +96,7 @@
           <w:sz w:val="22"/>
           <w:szCs w:val="22"/>
         </w:rPr>
-        <w:t xml:space="preserve">brasiltecpar.com.br está VERIFICADO na org de produção (concluído hoje). Os domínios sejaamigo.com.br, avato.com.br e taak.com.br aguardam a publicação do registro TXT pelos responsáveis de DNS (CSTI e contato local). As chaves DKIM foram criadas para os quatro domínios, mas dependem de oito registros CNAME ainda não publicados. A org Blink Telecom não foi conferida por falta de acesso administrativo.</w:t>
+        <w:t xml:space="preserve">brasiltecpar.com.br está VERIFICADO na org de produção (concluído hoje). Os domínios sejaamigo.com.br, avato.com.br e taak.com.br aguardam a publicação do registro TXT pelos responsáveis de DNS (CSTI e contato local). As chaves DKIM foram criadas para os quatro domínios, mas dependem de oito registros CNAME ainda não publicados. Na org Blink Telecom há três domínios cadastrados (blinktelecom.com.br, dreamm.com.br e salesforce.com), nenhum verificado, e o DNS de blinktelecom.com.br e dreamm.com.br não tem o registro TXT; o cadastro de salesforce.com é inválido e deve ser removido.</w:t>
       </w:r>
     </w:p>
     <w:tbl>
@@ -894,7 +894,7 @@
                 <w:sz w:val="19"/>
                 <w:szCs w:val="19"/>
               </w:rPr>
-              <w:t xml:space="preserve">Sem evidência</w:t>
+              <w:t xml:space="preserve">Não</w:t>
             </w:r>
           </w:p>
         </w:tc>
@@ -917,7 +917,7 @@
                 <w:sz w:val="19"/>
                 <w:szCs w:val="19"/>
               </w:rPr>
-              <w:t xml:space="preserve">Sem evidência</w:t>
+              <w:t xml:space="preserve">Não (sem chave)</w:t>
             </w:r>
           </w:p>
         </w:tc>
@@ -940,7 +940,7 @@
                 <w:sz w:val="19"/>
                 <w:szCs w:val="19"/>
               </w:rPr>
-              <w:t xml:space="preserve">Admin da org Blink executar o mesmo processo</w:t>
+              <w:t xml:space="preserve">Publicar TXT de verificação; criar chave DKIM</w:t>
             </w:r>
           </w:p>
         </w:tc>
@@ -963,7 +963,147 @@
                 <w:sz w:val="19"/>
                 <w:szCs w:val="19"/>
               </w:rPr>
-              <w:t xml:space="preserve">A definir</w:t>
+              <w:t xml:space="preserve">Contato local Blink</w:t>
+            </w:r>
+          </w:p>
+        </w:tc>
+      </w:tr>
+      <w:tr>
+        <w:tc>
+          <w:tcPr>
+            <w:tcW w:type="dxa" w:w="2000"/>
+            <w:tcMar>
+              <w:top w:type="dxa" w:w="60"/>
+              <w:left w:type="dxa" w:w="80"/>
+              <w:bottom w:type="dxa" w:w="60"/>
+              <w:right w:type="dxa" w:w="80"/>
+            </w:tcMar>
+          </w:tcPr>
+          <w:p>
+            <w:r>
+              <w:rPr>
+                <w:rFonts w:ascii="Calibri" w:cs="Calibri" w:eastAsia="Calibri" w:hAnsi="Calibri"/>
+                <w:b w:val="false"/>
+                <w:bCs w:val="false"/>
+                <w:sz w:val="19"/>
+                <w:szCs w:val="19"/>
+              </w:rPr>
+              <w:t xml:space="preserve">dreamm.com.br (org Blink)</w:t>
+            </w:r>
+          </w:p>
+        </w:tc>
+        <w:tc>
+          <w:tcPr>
+            <w:tcW w:type="dxa" w:w="1000"/>
+            <w:tcMar>
+              <w:top w:type="dxa" w:w="60"/>
+              <w:left w:type="dxa" w:w="80"/>
+              <w:bottom w:type="dxa" w:w="60"/>
+              <w:right w:type="dxa" w:w="80"/>
+            </w:tcMar>
+          </w:tcPr>
+          <w:p>
+            <w:r>
+              <w:rPr>
+                <w:rFonts w:ascii="Calibri" w:cs="Calibri" w:eastAsia="Calibri" w:hAnsi="Calibri"/>
+                <w:b w:val="false"/>
+                <w:bCs w:val="false"/>
+                <w:sz w:val="19"/>
+                <w:szCs w:val="19"/>
+              </w:rPr>
+              <w:t xml:space="preserve">n/d</w:t>
+            </w:r>
+          </w:p>
+        </w:tc>
+        <w:tc>
+          <w:tcPr>
+            <w:tcW w:type="dxa" w:w="1200"/>
+            <w:tcMar>
+              <w:top w:type="dxa" w:w="60"/>
+              <w:left w:type="dxa" w:w="80"/>
+              <w:bottom w:type="dxa" w:w="60"/>
+              <w:right w:type="dxa" w:w="80"/>
+            </w:tcMar>
+          </w:tcPr>
+          <w:p>
+            <w:r>
+              <w:rPr>
+                <w:rFonts w:ascii="Calibri" w:cs="Calibri" w:eastAsia="Calibri" w:hAnsi="Calibri"/>
+                <w:b w:val="false"/>
+                <w:bCs w:val="false"/>
+                <w:sz w:val="19"/>
+                <w:szCs w:val="19"/>
+              </w:rPr>
+              <w:t xml:space="preserve">Não</w:t>
+            </w:r>
+          </w:p>
+        </w:tc>
+        <w:tc>
+          <w:tcPr>
+            <w:tcW w:type="dxa" w:w="1000"/>
+            <w:tcMar>
+              <w:top w:type="dxa" w:w="60"/>
+              <w:left w:type="dxa" w:w="80"/>
+              <w:bottom w:type="dxa" w:w="60"/>
+              <w:right w:type="dxa" w:w="80"/>
+            </w:tcMar>
+          </w:tcPr>
+          <w:p>
+            <w:r>
+              <w:rPr>
+                <w:rFonts w:ascii="Calibri" w:cs="Calibri" w:eastAsia="Calibri" w:hAnsi="Calibri"/>
+                <w:b w:val="false"/>
+                <w:bCs w:val="false"/>
+                <w:sz w:val="19"/>
+                <w:szCs w:val="19"/>
+              </w:rPr>
+              <w:t xml:space="preserve">Não (sem chave)</w:t>
+            </w:r>
+          </w:p>
+        </w:tc>
+        <w:tc>
+          <w:tcPr>
+            <w:tcW w:type="dxa" w:w="2560"/>
+            <w:tcMar>
+              <w:top w:type="dxa" w:w="60"/>
+              <w:left w:type="dxa" w:w="80"/>
+              <w:bottom w:type="dxa" w:w="60"/>
+              <w:right w:type="dxa" w:w="80"/>
+            </w:tcMar>
+          </w:tcPr>
+          <w:p>
+            <w:r>
+              <w:rPr>
+                <w:rFonts w:ascii="Calibri" w:cs="Calibri" w:eastAsia="Calibri" w:hAnsi="Calibri"/>
+                <w:b w:val="false"/>
+                <w:bCs w:val="false"/>
+                <w:sz w:val="19"/>
+                <w:szCs w:val="19"/>
+              </w:rPr>
+              <w:t xml:space="preserve">Confirmar se envia e-mail; se sim, publicar TXT</w:t>
+            </w:r>
+          </w:p>
+        </w:tc>
+        <w:tc>
+          <w:tcPr>
+            <w:tcW w:type="dxa" w:w="1600"/>
+            <w:tcMar>
+              <w:top w:type="dxa" w:w="60"/>
+              <w:left w:type="dxa" w:w="80"/>
+              <w:bottom w:type="dxa" w:w="60"/>
+              <w:right w:type="dxa" w:w="80"/>
+            </w:tcMar>
+          </w:tcPr>
+          <w:p>
+            <w:r>
+              <w:rPr>
+                <w:rFonts w:ascii="Calibri" w:cs="Calibri" w:eastAsia="Calibri" w:hAnsi="Calibri"/>
+                <w:b w:val="false"/>
+                <w:bCs w:val="false"/>
+                <w:sz w:val="19"/>
+                <w:szCs w:val="19"/>
+              </w:rPr>
+              <w:t xml:space="preserve">Contato local Blink</w:t>
             </w:r>
           </w:p>
         </w:tc>
@@ -3624,6 +3764,529 @@
     </w:p>
     <w:p>
       <w:pPr>
+        <w:pStyle w:val="Heading2"/>
+        <w:spacing w:after="120" w:before="240"/>
+      </w:pPr>
+      <w:r>
+        <w:rPr>
+          <w:rFonts w:ascii="Calibri" w:cs="Calibri" w:eastAsia="Calibri" w:hAnsi="Calibri"/>
+        </w:rPr>
+        <w:t xml:space="preserve">3.4 Org Blink Telecom (Setup &gt; Domínios de email autorizados, 18/09)</w:t>
+      </w:r>
+    </w:p>
+    <w:tbl>
+      <w:tblPr>
+        <w:tblW w:type="dxa" w:w="9360"/>
+        <w:tblBorders>
+          <w:top w:val="single" w:color="auto" w:sz="4"/>
+          <w:left w:val="single" w:color="auto" w:sz="4"/>
+          <w:bottom w:val="single" w:color="auto" w:sz="4"/>
+          <w:right w:val="single" w:color="auto" w:sz="4"/>
+          <w:insideH w:val="single" w:color="auto" w:sz="4"/>
+          <w:insideV w:val="single" w:color="auto" w:sz="4"/>
+        </w:tblBorders>
+      </w:tblPr>
+      <w:tblGrid>
+        <w:gridCol w:w="1900"/>
+        <w:gridCol w:w="1300"/>
+        <w:gridCol w:w="2700"/>
+        <w:gridCol w:w="1700"/>
+        <w:gridCol w:w="1760"/>
+      </w:tblGrid>
+      <w:tr>
+        <w:trPr>
+          <w:tblHeader/>
+        </w:trPr>
+        <w:tc>
+          <w:tcPr>
+            <w:tcW w:type="dxa" w:w="1900"/>
+            <w:shd w:fill="D9E2F3" w:color="auto" w:val="clear"/>
+            <w:tcMar>
+              <w:top w:type="dxa" w:w="60"/>
+              <w:left w:type="dxa" w:w="80"/>
+              <w:bottom w:type="dxa" w:w="60"/>
+              <w:right w:type="dxa" w:w="80"/>
+            </w:tcMar>
+          </w:tcPr>
+          <w:p>
+            <w:r>
+              <w:rPr>
+                <w:rFonts w:ascii="Calibri" w:cs="Calibri" w:eastAsia="Calibri" w:hAnsi="Calibri"/>
+                <w:b/>
+                <w:bCs/>
+                <w:sz w:val="19"/>
+                <w:szCs w:val="19"/>
+              </w:rPr>
+              <w:t xml:space="preserve">Domínio cadastrado</w:t>
+            </w:r>
+          </w:p>
+        </w:tc>
+        <w:tc>
+          <w:tcPr>
+            <w:tcW w:type="dxa" w:w="1300"/>
+            <w:shd w:fill="D9E2F3" w:color="auto" w:val="clear"/>
+            <w:tcMar>
+              <w:top w:type="dxa" w:w="60"/>
+              <w:left w:type="dxa" w:w="80"/>
+              <w:bottom w:type="dxa" w:w="60"/>
+              <w:right w:type="dxa" w:w="80"/>
+            </w:tcMar>
+          </w:tcPr>
+          <w:p>
+            <w:r>
+              <w:rPr>
+                <w:rFonts w:ascii="Calibri" w:cs="Calibri" w:eastAsia="Calibri" w:hAnsi="Calibri"/>
+                <w:b/>
+                <w:bCs/>
+                <w:sz w:val="19"/>
+                <w:szCs w:val="19"/>
+              </w:rPr>
+              <w:t xml:space="preserve">Propriedade verificada</w:t>
+            </w:r>
+          </w:p>
+        </w:tc>
+        <w:tc>
+          <w:tcPr>
+            <w:tcW w:type="dxa" w:w="2700"/>
+            <w:shd w:fill="D9E2F3" w:color="auto" w:val="clear"/>
+            <w:tcMar>
+              <w:top w:type="dxa" w:w="60"/>
+              <w:left w:type="dxa" w:w="80"/>
+              <w:bottom w:type="dxa" w:w="60"/>
+              <w:right w:type="dxa" w:w="80"/>
+            </w:tcMar>
+          </w:tcPr>
+          <w:p>
+            <w:r>
+              <w:rPr>
+                <w:rFonts w:ascii="Calibri" w:cs="Calibri" w:eastAsia="Calibri" w:hAnsi="Calibri"/>
+                <w:b/>
+                <w:bCs/>
+                <w:sz w:val="19"/>
+                <w:szCs w:val="19"/>
+              </w:rPr>
+              <w:t xml:space="preserve">Código de verificação</w:t>
+            </w:r>
+          </w:p>
+        </w:tc>
+        <w:tc>
+          <w:tcPr>
+            <w:tcW w:type="dxa" w:w="1700"/>
+            <w:shd w:fill="D9E2F3" w:color="auto" w:val="clear"/>
+            <w:tcMar>
+              <w:top w:type="dxa" w:w="60"/>
+              <w:left w:type="dxa" w:w="80"/>
+              <w:bottom w:type="dxa" w:w="60"/>
+              <w:right w:type="dxa" w:w="80"/>
+            </w:tcMar>
+          </w:tcPr>
+          <w:p>
+            <w:r>
+              <w:rPr>
+                <w:rFonts w:ascii="Calibri" w:cs="Calibri" w:eastAsia="Calibri" w:hAnsi="Calibri"/>
+                <w:b/>
+                <w:bCs/>
+                <w:sz w:val="19"/>
+                <w:szCs w:val="19"/>
+              </w:rPr>
+              <w:t xml:space="preserve">DNS (18/09)</w:t>
+            </w:r>
+          </w:p>
+        </w:tc>
+        <w:tc>
+          <w:tcPr>
+            <w:tcW w:type="dxa" w:w="1760"/>
+            <w:shd w:fill="D9E2F3" w:color="auto" w:val="clear"/>
+            <w:tcMar>
+              <w:top w:type="dxa" w:w="60"/>
+              <w:left w:type="dxa" w:w="80"/>
+              <w:bottom w:type="dxa" w:w="60"/>
+              <w:right w:type="dxa" w:w="80"/>
+            </w:tcMar>
+          </w:tcPr>
+          <w:p>
+            <w:r>
+              <w:rPr>
+                <w:rFonts w:ascii="Calibri" w:cs="Calibri" w:eastAsia="Calibri" w:hAnsi="Calibri"/>
+                <w:b/>
+                <w:bCs/>
+                <w:sz w:val="19"/>
+                <w:szCs w:val="19"/>
+              </w:rPr>
+              <w:t xml:space="preserve">Observação</w:t>
+            </w:r>
+          </w:p>
+        </w:tc>
+      </w:tr>
+      <w:tr>
+        <w:tc>
+          <w:tcPr>
+            <w:tcW w:type="dxa" w:w="1900"/>
+            <w:tcMar>
+              <w:top w:type="dxa" w:w="60"/>
+              <w:left w:type="dxa" w:w="80"/>
+              <w:bottom w:type="dxa" w:w="60"/>
+              <w:right w:type="dxa" w:w="80"/>
+            </w:tcMar>
+          </w:tcPr>
+          <w:p>
+            <w:r>
+              <w:rPr>
+                <w:rFonts w:ascii="Calibri" w:cs="Calibri" w:eastAsia="Calibri" w:hAnsi="Calibri"/>
+                <w:b w:val="false"/>
+                <w:bCs w:val="false"/>
+                <w:sz w:val="19"/>
+                <w:szCs w:val="19"/>
+              </w:rPr>
+              <w:t xml:space="preserve">blinktelecom.com.br</w:t>
+            </w:r>
+          </w:p>
+        </w:tc>
+        <w:tc>
+          <w:tcPr>
+            <w:tcW w:type="dxa" w:w="1300"/>
+            <w:tcMar>
+              <w:top w:type="dxa" w:w="60"/>
+              <w:left w:type="dxa" w:w="80"/>
+              <w:bottom w:type="dxa" w:w="60"/>
+              <w:right w:type="dxa" w:w="80"/>
+            </w:tcMar>
+          </w:tcPr>
+          <w:p>
+            <w:r>
+              <w:rPr>
+                <w:rFonts w:ascii="Calibri" w:cs="Calibri" w:eastAsia="Calibri" w:hAnsi="Calibri"/>
+                <w:b w:val="false"/>
+                <w:bCs w:val="false"/>
+                <w:sz w:val="19"/>
+                <w:szCs w:val="19"/>
+              </w:rPr>
+              <w:t xml:space="preserve">Não</w:t>
+            </w:r>
+          </w:p>
+        </w:tc>
+        <w:tc>
+          <w:tcPr>
+            <w:tcW w:type="dxa" w:w="2700"/>
+            <w:tcMar>
+              <w:top w:type="dxa" w:w="60"/>
+              <w:left w:type="dxa" w:w="80"/>
+              <w:bottom w:type="dxa" w:w="60"/>
+              <w:right w:type="dxa" w:w="80"/>
+            </w:tcMar>
+          </w:tcPr>
+          <w:p>
+            <w:r>
+              <w:rPr>
+                <w:rFonts w:ascii="Calibri" w:cs="Calibri" w:eastAsia="Calibri" w:hAnsi="Calibri"/>
+                <w:b w:val="false"/>
+                <w:bCs w:val="false"/>
+                <w:sz w:val="19"/>
+                <w:szCs w:val="19"/>
+              </w:rPr>
+              <w:t xml:space="preserve">00D8c000007UaHU=1TBbJ00000003HF</w:t>
+            </w:r>
+          </w:p>
+        </w:tc>
+        <w:tc>
+          <w:tcPr>
+            <w:tcW w:type="dxa" w:w="1700"/>
+            <w:tcMar>
+              <w:top w:type="dxa" w:w="60"/>
+              <w:left w:type="dxa" w:w="80"/>
+              <w:bottom w:type="dxa" w:w="60"/>
+              <w:right w:type="dxa" w:w="80"/>
+            </w:tcMar>
+          </w:tcPr>
+          <w:p>
+            <w:r>
+              <w:rPr>
+                <w:rFonts w:ascii="Calibri" w:cs="Calibri" w:eastAsia="Calibri" w:hAnsi="Calibri"/>
+                <w:b w:val="false"/>
+                <w:bCs w:val="false"/>
+                <w:sz w:val="19"/>
+                <w:szCs w:val="19"/>
+              </w:rPr>
+              <w:t xml:space="preserve">TXT ausente (raiz e _sfdv)</w:t>
+            </w:r>
+          </w:p>
+        </w:tc>
+        <w:tc>
+          <w:tcPr>
+            <w:tcW w:type="dxa" w:w="1760"/>
+            <w:tcMar>
+              <w:top w:type="dxa" w:w="60"/>
+              <w:left w:type="dxa" w:w="80"/>
+              <w:bottom w:type="dxa" w:w="60"/>
+              <w:right w:type="dxa" w:w="80"/>
+            </w:tcMar>
+          </w:tcPr>
+          <w:p>
+            <w:r>
+              <w:rPr>
+                <w:rFonts w:ascii="Calibri" w:cs="Calibri" w:eastAsia="Calibri" w:hAnsi="Calibri"/>
+                <w:b w:val="false"/>
+                <w:bCs w:val="false"/>
+                <w:sz w:val="19"/>
+                <w:szCs w:val="19"/>
+              </w:rPr>
+              <w:t xml:space="preserve">Domínio principal da Blink; publicar o TXT</w:t>
+            </w:r>
+          </w:p>
+        </w:tc>
+      </w:tr>
+      <w:tr>
+        <w:tc>
+          <w:tcPr>
+            <w:tcW w:type="dxa" w:w="1900"/>
+            <w:tcMar>
+              <w:top w:type="dxa" w:w="60"/>
+              <w:left w:type="dxa" w:w="80"/>
+              <w:bottom w:type="dxa" w:w="60"/>
+              <w:right w:type="dxa" w:w="80"/>
+            </w:tcMar>
+          </w:tcPr>
+          <w:p>
+            <w:r>
+              <w:rPr>
+                <w:rFonts w:ascii="Calibri" w:cs="Calibri" w:eastAsia="Calibri" w:hAnsi="Calibri"/>
+                <w:b w:val="false"/>
+                <w:bCs w:val="false"/>
+                <w:sz w:val="19"/>
+                <w:szCs w:val="19"/>
+              </w:rPr>
+              <w:t xml:space="preserve">dreamm.com.br</w:t>
+            </w:r>
+          </w:p>
+        </w:tc>
+        <w:tc>
+          <w:tcPr>
+            <w:tcW w:type="dxa" w:w="1300"/>
+            <w:tcMar>
+              <w:top w:type="dxa" w:w="60"/>
+              <w:left w:type="dxa" w:w="80"/>
+              <w:bottom w:type="dxa" w:w="60"/>
+              <w:right w:type="dxa" w:w="80"/>
+            </w:tcMar>
+          </w:tcPr>
+          <w:p>
+            <w:r>
+              <w:rPr>
+                <w:rFonts w:ascii="Calibri" w:cs="Calibri" w:eastAsia="Calibri" w:hAnsi="Calibri"/>
+                <w:b w:val="false"/>
+                <w:bCs w:val="false"/>
+                <w:sz w:val="19"/>
+                <w:szCs w:val="19"/>
+              </w:rPr>
+              <w:t xml:space="preserve">Não</w:t>
+            </w:r>
+          </w:p>
+        </w:tc>
+        <w:tc>
+          <w:tcPr>
+            <w:tcW w:type="dxa" w:w="2700"/>
+            <w:tcMar>
+              <w:top w:type="dxa" w:w="60"/>
+              <w:left w:type="dxa" w:w="80"/>
+              <w:bottom w:type="dxa" w:w="60"/>
+              <w:right w:type="dxa" w:w="80"/>
+            </w:tcMar>
+          </w:tcPr>
+          <w:p>
+            <w:r>
+              <w:rPr>
+                <w:rFonts w:ascii="Calibri" w:cs="Calibri" w:eastAsia="Calibri" w:hAnsi="Calibri"/>
+                <w:b w:val="false"/>
+                <w:bCs w:val="false"/>
+                <w:sz w:val="19"/>
+                <w:szCs w:val="19"/>
+              </w:rPr>
+              <w:t xml:space="preserve">00D8c000007UaHU=1TBbJ00000003HG</w:t>
+            </w:r>
+          </w:p>
+        </w:tc>
+        <w:tc>
+          <w:tcPr>
+            <w:tcW w:type="dxa" w:w="1700"/>
+            <w:tcMar>
+              <w:top w:type="dxa" w:w="60"/>
+              <w:left w:type="dxa" w:w="80"/>
+              <w:bottom w:type="dxa" w:w="60"/>
+              <w:right w:type="dxa" w:w="80"/>
+            </w:tcMar>
+          </w:tcPr>
+          <w:p>
+            <w:r>
+              <w:rPr>
+                <w:rFonts w:ascii="Calibri" w:cs="Calibri" w:eastAsia="Calibri" w:hAnsi="Calibri"/>
+                <w:b w:val="false"/>
+                <w:bCs w:val="false"/>
+                <w:sz w:val="19"/>
+                <w:szCs w:val="19"/>
+              </w:rPr>
+              <w:t xml:space="preserve">TXT ausente; MX no Outlook</w:t>
+            </w:r>
+          </w:p>
+        </w:tc>
+        <w:tc>
+          <w:tcPr>
+            <w:tcW w:type="dxa" w:w="1760"/>
+            <w:tcMar>
+              <w:top w:type="dxa" w:w="60"/>
+              <w:left w:type="dxa" w:w="80"/>
+              <w:bottom w:type="dxa" w:w="60"/>
+              <w:right w:type="dxa" w:w="80"/>
+            </w:tcMar>
+          </w:tcPr>
+          <w:p>
+            <w:r>
+              <w:rPr>
+                <w:rFonts w:ascii="Calibri" w:cs="Calibri" w:eastAsia="Calibri" w:hAnsi="Calibri"/>
+                <w:b w:val="false"/>
+                <w:bCs w:val="false"/>
+                <w:sz w:val="19"/>
+                <w:szCs w:val="19"/>
+              </w:rPr>
+              <w:t xml:space="preserve">Confirmar se há usuários enviando por este domínio; senão, excluir o cadastro</w:t>
+            </w:r>
+          </w:p>
+        </w:tc>
+      </w:tr>
+      <w:tr>
+        <w:tc>
+          <w:tcPr>
+            <w:tcW w:type="dxa" w:w="1900"/>
+            <w:tcMar>
+              <w:top w:type="dxa" w:w="60"/>
+              <w:left w:type="dxa" w:w="80"/>
+              <w:bottom w:type="dxa" w:w="60"/>
+              <w:right w:type="dxa" w:w="80"/>
+            </w:tcMar>
+          </w:tcPr>
+          <w:p>
+            <w:r>
+              <w:rPr>
+                <w:rFonts w:ascii="Calibri" w:cs="Calibri" w:eastAsia="Calibri" w:hAnsi="Calibri"/>
+                <w:b w:val="false"/>
+                <w:bCs w:val="false"/>
+                <w:sz w:val="19"/>
+                <w:szCs w:val="19"/>
+              </w:rPr>
+              <w:t xml:space="preserve">salesforce.com</w:t>
+            </w:r>
+          </w:p>
+        </w:tc>
+        <w:tc>
+          <w:tcPr>
+            <w:tcW w:type="dxa" w:w="1300"/>
+            <w:tcMar>
+              <w:top w:type="dxa" w:w="60"/>
+              <w:left w:type="dxa" w:w="80"/>
+              <w:bottom w:type="dxa" w:w="60"/>
+              <w:right w:type="dxa" w:w="80"/>
+            </w:tcMar>
+          </w:tcPr>
+          <w:p>
+            <w:r>
+              <w:rPr>
+                <w:rFonts w:ascii="Calibri" w:cs="Calibri" w:eastAsia="Calibri" w:hAnsi="Calibri"/>
+                <w:b w:val="false"/>
+                <w:bCs w:val="false"/>
+                <w:sz w:val="19"/>
+                <w:szCs w:val="19"/>
+              </w:rPr>
+              <w:t xml:space="preserve">Não</w:t>
+            </w:r>
+          </w:p>
+        </w:tc>
+        <w:tc>
+          <w:tcPr>
+            <w:tcW w:type="dxa" w:w="2700"/>
+            <w:tcMar>
+              <w:top w:type="dxa" w:w="60"/>
+              <w:left w:type="dxa" w:w="80"/>
+              <w:bottom w:type="dxa" w:w="60"/>
+              <w:right w:type="dxa" w:w="80"/>
+            </w:tcMar>
+          </w:tcPr>
+          <w:p>
+            <w:r>
+              <w:rPr>
+                <w:rFonts w:ascii="Calibri" w:cs="Calibri" w:eastAsia="Calibri" w:hAnsi="Calibri"/>
+                <w:b w:val="false"/>
+                <w:bCs w:val="false"/>
+                <w:sz w:val="19"/>
+                <w:szCs w:val="19"/>
+              </w:rPr>
+              <w:t xml:space="preserve">00D8c000007UaHU=1TBbJ00000003HH</w:t>
+            </w:r>
+          </w:p>
+        </w:tc>
+        <w:tc>
+          <w:tcPr>
+            <w:tcW w:type="dxa" w:w="1700"/>
+            <w:tcMar>
+              <w:top w:type="dxa" w:w="60"/>
+              <w:left w:type="dxa" w:w="80"/>
+              <w:bottom w:type="dxa" w:w="60"/>
+              <w:right w:type="dxa" w:w="80"/>
+            </w:tcMar>
+          </w:tcPr>
+          <w:p>
+            <w:r>
+              <w:rPr>
+                <w:rFonts w:ascii="Calibri" w:cs="Calibri" w:eastAsia="Calibri" w:hAnsi="Calibri"/>
+                <w:b w:val="false"/>
+                <w:bCs w:val="false"/>
+                <w:sz w:val="19"/>
+                <w:szCs w:val="19"/>
+              </w:rPr>
+              <w:t xml:space="preserve">não aplicável</w:t>
+            </w:r>
+          </w:p>
+        </w:tc>
+        <w:tc>
+          <w:tcPr>
+            <w:tcW w:type="dxa" w:w="1760"/>
+            <w:tcMar>
+              <w:top w:type="dxa" w:w="60"/>
+              <w:left w:type="dxa" w:w="80"/>
+              <w:bottom w:type="dxa" w:w="60"/>
+              <w:right w:type="dxa" w:w="80"/>
+            </w:tcMar>
+          </w:tcPr>
+          <w:p>
+            <w:r>
+              <w:rPr>
+                <w:rFonts w:ascii="Calibri" w:cs="Calibri" w:eastAsia="Calibri" w:hAnsi="Calibri"/>
+                <w:b w:val="false"/>
+                <w:bCs w:val="false"/>
+                <w:sz w:val="19"/>
+                <w:szCs w:val="19"/>
+              </w:rPr>
+              <w:t xml:space="preserve">Cadastro inválido (domínio de terceiro); excluir</w:t>
+            </w:r>
+          </w:p>
+        </w:tc>
+      </w:tr>
+    </w:tbl>
+    <w:p>
+      <w:pPr>
+        <w:spacing w:after="120"/>
+      </w:pPr>
+      <w:r>
+        <w:rPr>
+          <w:rFonts w:ascii="Calibri" w:cs="Calibri" w:eastAsia="Calibri" w:hAnsi="Calibri"/>
+          <w:b w:val="false"/>
+          <w:bCs w:val="false"/>
+          <w:sz w:val="22"/>
+          <w:szCs w:val="22"/>
+        </w:rPr>
+        <w:t xml:space="preserve">Não há chaves DKIM criadas na org Blink. SPF de blinktelecom.com.br: Google e Amazon SES, sem Salesforce.</w:t>
+      </w:r>
+    </w:p>
+    <w:p>
+      <w:pPr>
         <w:pStyle w:val="Heading1"/>
         <w:spacing w:after="120" w:before="240"/>
       </w:pPr>
@@ -4266,7 +4929,7 @@
                 <w:sz w:val="19"/>
                 <w:szCs w:val="19"/>
               </w:rPr>
-              <w:t xml:space="preserve">Org Blink Telecom: identificar o administrador e repetir todo o processo para blinktelecom.com.br</w:t>
+              <w:t xml:space="preserve">Org Blink: excluir o cadastro de salesforce.com; confirmar uso de dreamm.com.br; publicar TXT 00D8c000007UaHU=1TBbJ00000003HF em blinktelecom.com.br (e o de dreamm, se usado); criar chave DKIM e publicar os CNAMEs</w:t>
             </w:r>
           </w:p>
         </w:tc>
@@ -4289,7 +4952,7 @@
                 <w:sz w:val="19"/>
                 <w:szCs w:val="19"/>
               </w:rPr>
-              <w:t xml:space="preserve">Gerson define</w:t>
+              <w:t xml:space="preserve">Diego (org) / contato local Blink (DNS)</w:t>
             </w:r>
           </w:p>
         </w:tc>
@@ -4475,7 +5138,7 @@
           <w:sz w:val="22"/>
           <w:szCs w:val="22"/>
         </w:rPr>
-        <w:t xml:space="preserve">Org Blink Telecom: mesmo efeito para todos os envios, se nada for feito lá.</w:t>
+        <w:t xml:space="preserve">E-mails de @blinktelecom.com.br (org Blink): mesmo efeito, endereço substituto, até o TXT ser publicado e verificado.</w:t>
       </w:r>
     </w:p>
     <w:p>

</xml_diff>